<commit_message>
Documentation update to include new RFIDTag information
</commit_message>
<xml_diff>
--- a/docs/Assistive_Backpack_V1_Library_User_Guide_Updated.docx
+++ b/docs/Assistive_Backpack_V1_Library_User_Guide_Updated.docx
@@ -410,28 +410,7 @@
       </w:r>
       <w:r>
         <w:br/>
-      </w:r>
-      <w:r>
-        <w:t xml:space="preserve">These values can be updated in the </w:t>
-      </w:r>
-      <w:proofErr w:type="spellStart"/>
-      <w:r>
-        <w:t>Config</w:t>
-      </w:r>
-      <w:r>
-        <w:t>.h</w:t>
-      </w:r>
-      <w:proofErr w:type="spellEnd"/>
-      <w:r>
-        <w:t xml:space="preserve"> file in the \</w:t>
-      </w:r>
-      <w:proofErr w:type="spellStart"/>
-      <w:r>
-        <w:t>src</w:t>
-      </w:r>
-      <w:proofErr w:type="spellEnd"/>
-      <w:r>
-        <w:t xml:space="preserve"> of the Arduino library.</w:t>
+        <w:t>These values can be updated in the Config.h file in the \src of the Arduino library.</w:t>
       </w:r>
     </w:p>
     <w:tbl>
@@ -650,6 +629,51 @@
             </w:pPr>
             <w:r>
               <w:t>Maximum events stored in EventGenerator's fixed queue.</w:t>
+            </w:r>
+          </w:p>
+        </w:tc>
+      </w:tr>
+      <w:tr>
+        <w:trPr>
+          <w:cnfStyle w:val="000000100000" w:firstRow="0" w:lastRow="0" w:firstColumn="0" w:lastColumn="0" w:oddVBand="0" w:evenVBand="0" w:oddHBand="1" w:evenHBand="0" w:firstRowFirstColumn="0" w:firstRowLastColumn="0" w:lastRowFirstColumn="0" w:lastRowLastColumn="0"/>
+        </w:trPr>
+        <w:tc>
+          <w:tcPr>
+            <w:cnfStyle w:val="001000000000" w:firstRow="0" w:lastRow="0" w:firstColumn="1" w:lastColumn="0" w:oddVBand="0" w:evenVBand="0" w:oddHBand="0" w:evenHBand="0" w:firstRowFirstColumn="0" w:firstRowLastColumn="0" w:lastRowFirstColumn="0" w:lastRowLastColumn="0"/>
+            <w:tcW w:w="3360" w:type="dxa"/>
+          </w:tcPr>
+          <w:p>
+            <w:r>
+              <w:rPr>
+                <w:lang w:val="en-AU"/>
+              </w:rPr>
+              <w:t>MAX_RFID_UID_BYTES</w:t>
+            </w:r>
+          </w:p>
+        </w:tc>
+        <w:tc>
+          <w:tcPr>
+            <w:tcW w:w="3360" w:type="dxa"/>
+          </w:tcPr>
+          <w:p>
+            <w:pPr>
+              <w:cnfStyle w:val="000000100000" w:firstRow="0" w:lastRow="0" w:firstColumn="0" w:lastColumn="0" w:oddVBand="0" w:evenVBand="0" w:oddHBand="1" w:evenHBand="0" w:firstRowFirstColumn="0" w:firstRowLastColumn="0" w:lastRowFirstColumn="0" w:lastRowLastColumn="0"/>
+            </w:pPr>
+            <w:r>
+              <w:t>10</w:t>
+            </w:r>
+          </w:p>
+        </w:tc>
+        <w:tc>
+          <w:tcPr>
+            <w:tcW w:w="3360" w:type="dxa"/>
+          </w:tcPr>
+          <w:p>
+            <w:pPr>
+              <w:cnfStyle w:val="000000100000" w:firstRow="0" w:lastRow="0" w:firstColumn="0" w:lastColumn="0" w:oddVBand="0" w:evenVBand="0" w:oddHBand="1" w:evenHBand="0" w:firstRowFirstColumn="0" w:firstRowLastColumn="0" w:lastRowFirstColumn="0" w:lastRowLastColumn="0"/>
+            </w:pPr>
+            <w:r>
+              <w:t>Maximum number of bytes read from an RFID tag</w:t>
             </w:r>
           </w:p>
         </w:tc>
@@ -685,23 +709,7 @@
       </w:r>
       <w:r>
         <w:br/>
-        <w:t xml:space="preserve">These values can be updated in the </w:t>
-      </w:r>
-      <w:proofErr w:type="spellStart"/>
-      <w:r>
-        <w:t>Item.h</w:t>
-      </w:r>
-      <w:proofErr w:type="spellEnd"/>
-      <w:r>
-        <w:t xml:space="preserve"> file in the \</w:t>
-      </w:r>
-      <w:proofErr w:type="spellStart"/>
-      <w:r>
-        <w:t>src</w:t>
-      </w:r>
-      <w:proofErr w:type="spellEnd"/>
-      <w:r>
-        <w:t xml:space="preserve"> of the Arduino library.</w:t>
+        <w:t>These values can be updated in the Item.h file in the \src of the Arduino library.</w:t>
       </w:r>
     </w:p>
     <w:tbl>
@@ -1049,13 +1057,8 @@
             <w:tcW w:w="3360" w:type="dxa"/>
           </w:tcPr>
           <w:p>
-            <w:proofErr w:type="gramStart"/>
-            <w:r>
-              <w:t>ItemType::</w:t>
-            </w:r>
-            <w:proofErr w:type="gramEnd"/>
-            <w:r>
-              <w:t>Medication</w:t>
+            <w:r>
+              <w:t>ItemType::Medication</w:t>
             </w:r>
           </w:p>
         </w:tc>
@@ -1096,13 +1099,8 @@
             <w:tcW w:w="3360" w:type="dxa"/>
           </w:tcPr>
           <w:p>
-            <w:proofErr w:type="gramStart"/>
-            <w:r>
-              <w:t>ItemType::</w:t>
-            </w:r>
-            <w:proofErr w:type="gramEnd"/>
-            <w:r>
-              <w:t>Glasses</w:t>
+            <w:r>
+              <w:t>ItemType::Glasses</w:t>
             </w:r>
           </w:p>
         </w:tc>
@@ -1140,11 +1138,9 @@
             <w:tcW w:w="3360" w:type="dxa"/>
           </w:tcPr>
           <w:p>
-            <w:proofErr w:type="gramStart"/>
             <w:r>
               <w:t>ItemType::</w:t>
             </w:r>
-            <w:proofErr w:type="gramEnd"/>
             <w:r>
               <w:t>Umbrella</w:t>
             </w:r>
@@ -1187,13 +1183,8 @@
             <w:tcW w:w="3360" w:type="dxa"/>
           </w:tcPr>
           <w:p>
-            <w:proofErr w:type="gramStart"/>
-            <w:r>
-              <w:t>ItemType::</w:t>
-            </w:r>
-            <w:proofErr w:type="gramEnd"/>
-            <w:r>
-              <w:t>Book</w:t>
+            <w:r>
+              <w:t>ItemType::Book</w:t>
             </w:r>
           </w:p>
         </w:tc>
@@ -1231,13 +1222,8 @@
             <w:tcW w:w="3360" w:type="dxa"/>
           </w:tcPr>
           <w:p>
-            <w:proofErr w:type="gramStart"/>
-            <w:r>
-              <w:t>ItemType::</w:t>
-            </w:r>
-            <w:proofErr w:type="gramEnd"/>
-            <w:r>
-              <w:t>Headphones</w:t>
+            <w:r>
+              <w:t>ItemType::Headphones</w:t>
             </w:r>
           </w:p>
         </w:tc>
@@ -1278,13 +1264,8 @@
             <w:tcW w:w="3360" w:type="dxa"/>
           </w:tcPr>
           <w:p>
-            <w:proofErr w:type="gramStart"/>
-            <w:r>
-              <w:t>ItemType::</w:t>
-            </w:r>
-            <w:proofErr w:type="gramEnd"/>
-            <w:r>
-              <w:t>Diary</w:t>
+            <w:r>
+              <w:t>ItemType::Diary</w:t>
             </w:r>
           </w:p>
         </w:tc>
@@ -1520,28 +1501,7 @@
       </w:r>
       <w:r>
         <w:br/>
-      </w:r>
-      <w:r>
-        <w:t xml:space="preserve">These values can be updated in the </w:t>
-      </w:r>
-      <w:proofErr w:type="spellStart"/>
-      <w:r>
-        <w:t>Task</w:t>
-      </w:r>
-      <w:r>
-        <w:t>.h</w:t>
-      </w:r>
-      <w:proofErr w:type="spellEnd"/>
-      <w:r>
-        <w:t xml:space="preserve"> file in the \</w:t>
-      </w:r>
-      <w:proofErr w:type="spellStart"/>
-      <w:r>
-        <w:t>src</w:t>
-      </w:r>
-      <w:proofErr w:type="spellEnd"/>
-      <w:r>
-        <w:t xml:space="preserve"> of the Arduino library.</w:t>
+        <w:t>These values can be updated in the Task.h file in the \src of the Arduino library.</w:t>
       </w:r>
     </w:p>
     <w:tbl>
@@ -1769,13 +1729,8 @@
             <w:tcW w:w="3360" w:type="dxa"/>
           </w:tcPr>
           <w:p>
-            <w:proofErr w:type="gramStart"/>
-            <w:r>
-              <w:t>TaskType::</w:t>
-            </w:r>
-            <w:proofErr w:type="gramEnd"/>
-            <w:r>
-              <w:t>Doctors</w:t>
+            <w:r>
+              <w:t>TaskType::Doctor</w:t>
             </w:r>
           </w:p>
         </w:tc>
@@ -1813,13 +1768,9 @@
             <w:tcW w:w="3360" w:type="dxa"/>
           </w:tcPr>
           <w:p>
-            <w:proofErr w:type="gramStart"/>
-            <w:r>
-              <w:t>TaskType::</w:t>
-            </w:r>
-            <w:proofErr w:type="gramEnd"/>
-            <w:r>
-              <w:t>Park</w:t>
+            <w:r>
+              <w:lastRenderedPageBreak/>
+              <w:t>TaskType::Park</w:t>
             </w:r>
           </w:p>
         </w:tc>
@@ -1860,16 +1811,9 @@
             <w:tcW w:w="3360" w:type="dxa"/>
           </w:tcPr>
           <w:p>
-            <w:proofErr w:type="gramStart"/>
-            <w:r>
-              <w:t>TaskType::</w:t>
-            </w:r>
-            <w:proofErr w:type="spellStart"/>
-            <w:proofErr w:type="gramEnd"/>
-            <w:r>
-              <w:t>FriendsHouse</w:t>
-            </w:r>
-            <w:proofErr w:type="spellEnd"/>
+            <w:r>
+              <w:t>TaskType::FriendsHouse</w:t>
+            </w:r>
           </w:p>
         </w:tc>
         <w:tc>
@@ -1894,17 +1838,7 @@
               <w:cnfStyle w:val="000000100000" w:firstRow="0" w:lastRow="0" w:firstColumn="0" w:lastColumn="0" w:oddVBand="0" w:evenVBand="0" w:oddHBand="1" w:evenHBand="0" w:firstRowFirstColumn="0" w:firstRowLastColumn="0" w:lastRowFirstColumn="0" w:lastRowLastColumn="0"/>
             </w:pPr>
             <w:r>
-              <w:t xml:space="preserve">Visit a </w:t>
-            </w:r>
-            <w:proofErr w:type="spellStart"/>
-            <w:proofErr w:type="gramStart"/>
-            <w:r>
-              <w:t>friends</w:t>
-            </w:r>
-            <w:proofErr w:type="spellEnd"/>
-            <w:proofErr w:type="gramEnd"/>
-            <w:r>
-              <w:t xml:space="preserve"> house.</w:t>
+              <w:t>Visit a friends house.</w:t>
             </w:r>
           </w:p>
         </w:tc>
@@ -1915,16 +1849,7 @@
         <w:pStyle w:val="Heading2"/>
       </w:pPr>
       <w:r>
-        <w:lastRenderedPageBreak/>
-        <w:t xml:space="preserve">4.4 </w:t>
-      </w:r>
-      <w:proofErr w:type="spellStart"/>
-      <w:r>
-        <w:t>BackpackState</w:t>
-      </w:r>
-      <w:proofErr w:type="spellEnd"/>
-      <w:r>
-        <w:t xml:space="preserve"> — state-machine state</w:t>
+        <w:t>4.4 BackpackState — state-machine state</w:t>
       </w:r>
     </w:p>
     <w:p>
@@ -2727,7 +2652,10 @@
         <w:pStyle w:val="ListBullet"/>
       </w:pPr>
       <w:r>
-        <w:t>uint32_t tagID — RFID tag identifier for the physical item.</w:t>
+        <w:t>RFIDTagID</w:t>
+      </w:r>
+      <w:r>
+        <w:t xml:space="preserve"> — RFID tag identifier for the physical item.</w:t>
       </w:r>
     </w:p>
     <w:p>
@@ -2747,9 +2675,319 @@
       </w:r>
     </w:p>
     <w:p>
+      <w:pPr>
+        <w:pStyle w:val="ListBullet"/>
+        <w:numPr>
+          <w:ilvl w:val="0"/>
+          <w:numId w:val="0"/>
+        </w:numPr>
+      </w:pPr>
+    </w:p>
+    <w:p>
       <w:r>
-        <w:t>A tag ID identifies a registered physical tag; ItemType describes the category assigned to that tag. Do not use a tag ID where a Task requires an ItemType.</w:t>
+        <w:t>A tag ID identifies a registered physical tag; ItemType describes the category assigned to that tag. Do not use a tag ID where a Task requires an ItemType. The RFIDTagID is stored as a variable length byte array (maximum 10 bytes).</w:t>
       </w:r>
+      <w:r>
+        <w:t xml:space="preserve"> The most common length is 4 bytes</w:t>
+      </w:r>
+      <w:r>
+        <w:t>.</w:t>
+      </w:r>
+    </w:p>
+    <w:p>
+      <w:pPr>
+        <w:pStyle w:val="ListBullet"/>
+        <w:numPr>
+          <w:ilvl w:val="0"/>
+          <w:numId w:val="0"/>
+        </w:numPr>
+        <w:ind w:left="360" w:hanging="360"/>
+      </w:pPr>
+    </w:p>
+    <w:p>
+      <w:pPr>
+        <w:pStyle w:val="ListBullet"/>
+        <w:numPr>
+          <w:ilvl w:val="0"/>
+          <w:numId w:val="0"/>
+        </w:numPr>
+        <w:ind w:left="360" w:hanging="360"/>
+      </w:pPr>
+    </w:p>
+    <w:p>
+      <w:pPr>
+        <w:pStyle w:val="ListBullet"/>
+        <w:numPr>
+          <w:ilvl w:val="0"/>
+          <w:numId w:val="0"/>
+        </w:numPr>
+      </w:pPr>
+    </w:p>
+    <w:tbl>
+      <w:tblPr>
+        <w:tblStyle w:val="LightShading-Accent1"/>
+        <w:tblW w:w="0" w:type="auto"/>
+        <w:tblLook w:val="04A0" w:firstRow="1" w:lastRow="0" w:firstColumn="1" w:lastColumn="0" w:noHBand="0" w:noVBand="1"/>
+      </w:tblPr>
+      <w:tblGrid>
+        <w:gridCol w:w="5148"/>
+        <w:gridCol w:w="5148"/>
+      </w:tblGrid>
+      <w:tr>
+        <w:trPr>
+          <w:cnfStyle w:val="100000000000" w:firstRow="1" w:lastRow="0" w:firstColumn="0" w:lastColumn="0" w:oddVBand="0" w:evenVBand="0" w:oddHBand="0" w:evenHBand="0" w:firstRowFirstColumn="0" w:firstRowLastColumn="0" w:lastRowFirstColumn="0" w:lastRowLastColumn="0"/>
+        </w:trPr>
+        <w:tc>
+          <w:tcPr>
+            <w:cnfStyle w:val="001000000000" w:firstRow="0" w:lastRow="0" w:firstColumn="1" w:lastColumn="0" w:oddVBand="0" w:evenVBand="0" w:oddHBand="0" w:evenHBand="0" w:firstRowFirstColumn="0" w:firstRowLastColumn="0" w:lastRowFirstColumn="0" w:lastRowLastColumn="0"/>
+            <w:tcW w:w="5148" w:type="dxa"/>
+          </w:tcPr>
+          <w:p>
+            <w:pPr>
+              <w:pStyle w:val="ListBullet"/>
+              <w:numPr>
+                <w:ilvl w:val="0"/>
+                <w:numId w:val="0"/>
+              </w:numPr>
+              <w:rPr>
+                <w:lang w:val="en-AU"/>
+              </w:rPr>
+            </w:pPr>
+            <w:r>
+              <w:rPr>
+                <w:lang w:val="en-AU"/>
+              </w:rPr>
+              <w:t>struct RFIDTagID</w:t>
+            </w:r>
+          </w:p>
+          <w:p>
+            <w:pPr>
+              <w:pStyle w:val="ListBullet"/>
+              <w:numPr>
+                <w:ilvl w:val="0"/>
+                <w:numId w:val="0"/>
+              </w:numPr>
+              <w:ind w:left="360" w:hanging="360"/>
+              <w:rPr>
+                <w:lang w:val="en-AU"/>
+              </w:rPr>
+            </w:pPr>
+            <w:r>
+              <w:rPr>
+                <w:lang w:val="en-AU"/>
+              </w:rPr>
+              <w:t>{</w:t>
+            </w:r>
+          </w:p>
+          <w:p>
+            <w:pPr>
+              <w:pStyle w:val="ListBullet"/>
+              <w:numPr>
+                <w:ilvl w:val="0"/>
+                <w:numId w:val="0"/>
+              </w:numPr>
+              <w:ind w:left="360" w:hanging="360"/>
+              <w:rPr>
+                <w:lang w:val="en-AU"/>
+              </w:rPr>
+            </w:pPr>
+            <w:r>
+              <w:rPr>
+                <w:lang w:val="en-AU"/>
+              </w:rPr>
+              <w:t>    uint8_t bytes[MAX_RFID_UID_BYTES];</w:t>
+            </w:r>
+          </w:p>
+          <w:p>
+            <w:pPr>
+              <w:pStyle w:val="ListBullet"/>
+              <w:numPr>
+                <w:ilvl w:val="0"/>
+                <w:numId w:val="0"/>
+              </w:numPr>
+              <w:ind w:left="360" w:hanging="360"/>
+              <w:rPr>
+                <w:lang w:val="en-AU"/>
+              </w:rPr>
+            </w:pPr>
+            <w:r>
+              <w:rPr>
+                <w:lang w:val="en-AU"/>
+              </w:rPr>
+              <w:t>    uint8_t length;</w:t>
+            </w:r>
+          </w:p>
+          <w:p>
+            <w:pPr>
+              <w:pStyle w:val="ListBullet"/>
+              <w:numPr>
+                <w:ilvl w:val="0"/>
+                <w:numId w:val="0"/>
+              </w:numPr>
+              <w:ind w:left="360" w:hanging="360"/>
+              <w:rPr>
+                <w:lang w:val="en-AU"/>
+              </w:rPr>
+            </w:pPr>
+            <w:r>
+              <w:rPr>
+                <w:lang w:val="en-AU"/>
+              </w:rPr>
+              <w:t>};</w:t>
+            </w:r>
+          </w:p>
+          <w:p>
+            <w:pPr>
+              <w:pStyle w:val="ListBullet"/>
+              <w:numPr>
+                <w:ilvl w:val="0"/>
+                <w:numId w:val="0"/>
+              </w:numPr>
+              <w:ind w:left="360"/>
+            </w:pPr>
+          </w:p>
+        </w:tc>
+        <w:tc>
+          <w:tcPr>
+            <w:tcW w:w="5148" w:type="dxa"/>
+          </w:tcPr>
+          <w:p>
+            <w:pPr>
+              <w:pStyle w:val="ListBullet"/>
+              <w:numPr>
+                <w:ilvl w:val="0"/>
+                <w:numId w:val="0"/>
+              </w:numPr>
+              <w:spacing w:after="200" w:line="276" w:lineRule="auto"/>
+              <w:ind w:left="360" w:hanging="360"/>
+              <w:cnfStyle w:val="100000000000" w:firstRow="1" w:lastRow="0" w:firstColumn="0" w:lastColumn="0" w:oddVBand="0" w:evenVBand="0" w:oddHBand="0" w:evenHBand="0" w:firstRowFirstColumn="0" w:firstRowLastColumn="0" w:lastRowFirstColumn="0" w:lastRowLastColumn="0"/>
+              <w:rPr>
+                <w:lang w:val="en-AU"/>
+              </w:rPr>
+            </w:pPr>
+            <w:r>
+              <w:rPr>
+                <w:lang w:val="en-AU"/>
+              </w:rPr>
+              <w:t>struct Item</w:t>
+            </w:r>
+          </w:p>
+          <w:p>
+            <w:pPr>
+              <w:pStyle w:val="ListBullet"/>
+              <w:numPr>
+                <w:ilvl w:val="0"/>
+                <w:numId w:val="0"/>
+              </w:numPr>
+              <w:spacing w:after="200" w:line="276" w:lineRule="auto"/>
+              <w:ind w:left="360" w:hanging="360"/>
+              <w:cnfStyle w:val="100000000000" w:firstRow="1" w:lastRow="0" w:firstColumn="0" w:lastColumn="0" w:oddVBand="0" w:evenVBand="0" w:oddHBand="0" w:evenHBand="0" w:firstRowFirstColumn="0" w:firstRowLastColumn="0" w:lastRowFirstColumn="0" w:lastRowLastColumn="0"/>
+              <w:rPr>
+                <w:lang w:val="en-AU"/>
+              </w:rPr>
+            </w:pPr>
+            <w:r>
+              <w:rPr>
+                <w:lang w:val="en-AU"/>
+              </w:rPr>
+              <w:t>{</w:t>
+            </w:r>
+          </w:p>
+          <w:p>
+            <w:pPr>
+              <w:pStyle w:val="ListBullet"/>
+              <w:numPr>
+                <w:ilvl w:val="0"/>
+                <w:numId w:val="0"/>
+              </w:numPr>
+              <w:spacing w:after="200" w:line="276" w:lineRule="auto"/>
+              <w:ind w:left="360" w:hanging="360"/>
+              <w:cnfStyle w:val="100000000000" w:firstRow="1" w:lastRow="0" w:firstColumn="0" w:lastColumn="0" w:oddVBand="0" w:evenVBand="0" w:oddHBand="0" w:evenHBand="0" w:firstRowFirstColumn="0" w:firstRowLastColumn="0" w:lastRowFirstColumn="0" w:lastRowLastColumn="0"/>
+              <w:rPr>
+                <w:lang w:val="en-AU"/>
+              </w:rPr>
+            </w:pPr>
+            <w:r>
+              <w:rPr>
+                <w:lang w:val="en-AU"/>
+              </w:rPr>
+              <w:t>    RFIDTagID tagID;</w:t>
+            </w:r>
+          </w:p>
+          <w:p>
+            <w:pPr>
+              <w:pStyle w:val="ListBullet"/>
+              <w:numPr>
+                <w:ilvl w:val="0"/>
+                <w:numId w:val="0"/>
+              </w:numPr>
+              <w:spacing w:after="200" w:line="276" w:lineRule="auto"/>
+              <w:ind w:left="360" w:hanging="360"/>
+              <w:cnfStyle w:val="100000000000" w:firstRow="1" w:lastRow="0" w:firstColumn="0" w:lastColumn="0" w:oddVBand="0" w:evenVBand="0" w:oddHBand="0" w:evenHBand="0" w:firstRowFirstColumn="0" w:firstRowLastColumn="0" w:lastRowFirstColumn="0" w:lastRowLastColumn="0"/>
+              <w:rPr>
+                <w:lang w:val="en-AU"/>
+              </w:rPr>
+            </w:pPr>
+            <w:r>
+              <w:rPr>
+                <w:lang w:val="en-AU"/>
+              </w:rPr>
+              <w:t>    ItemType type;</w:t>
+            </w:r>
+          </w:p>
+          <w:p>
+            <w:pPr>
+              <w:pStyle w:val="ListBullet"/>
+              <w:numPr>
+                <w:ilvl w:val="0"/>
+                <w:numId w:val="0"/>
+              </w:numPr>
+              <w:spacing w:after="200" w:line="276" w:lineRule="auto"/>
+              <w:ind w:left="360" w:hanging="360"/>
+              <w:cnfStyle w:val="100000000000" w:firstRow="1" w:lastRow="0" w:firstColumn="0" w:lastColumn="0" w:oddVBand="0" w:evenVBand="0" w:oddHBand="0" w:evenHBand="0" w:firstRowFirstColumn="0" w:firstRowLastColumn="0" w:lastRowFirstColumn="0" w:lastRowLastColumn="0"/>
+              <w:rPr>
+                <w:lang w:val="en-AU"/>
+              </w:rPr>
+            </w:pPr>
+            <w:r>
+              <w:rPr>
+                <w:lang w:val="en-AU"/>
+              </w:rPr>
+              <w:t>    Location location;</w:t>
+            </w:r>
+          </w:p>
+          <w:p>
+            <w:pPr>
+              <w:pStyle w:val="ListBullet"/>
+              <w:numPr>
+                <w:ilvl w:val="0"/>
+                <w:numId w:val="0"/>
+              </w:numPr>
+              <w:spacing w:after="200" w:line="276" w:lineRule="auto"/>
+              <w:ind w:left="360" w:hanging="360"/>
+              <w:cnfStyle w:val="100000000000" w:firstRow="1" w:lastRow="0" w:firstColumn="0" w:lastColumn="0" w:oddVBand="0" w:evenVBand="0" w:oddHBand="0" w:evenHBand="0" w:firstRowFirstColumn="0" w:firstRowLastColumn="0" w:lastRowFirstColumn="0" w:lastRowLastColumn="0"/>
+              <w:rPr>
+                <w:lang w:val="en-AU"/>
+              </w:rPr>
+            </w:pPr>
+            <w:r>
+              <w:rPr>
+                <w:lang w:val="en-AU"/>
+              </w:rPr>
+              <w:t>};</w:t>
+            </w:r>
+          </w:p>
+        </w:tc>
+      </w:tr>
+    </w:tbl>
+    <w:p>
+      <w:pPr>
+        <w:pStyle w:val="ListBullet"/>
+        <w:numPr>
+          <w:ilvl w:val="0"/>
+          <w:numId w:val="0"/>
+        </w:numPr>
+      </w:pPr>
     </w:p>
     <w:p>
       <w:pPr>
@@ -2785,7 +3023,6 @@
         <w:pStyle w:val="ListBullet"/>
       </w:pPr>
       <w:r>
-        <w:lastRenderedPageBreak/>
         <w:t>uint8_t itemCount — number of valid entries in requiredItems.</w:t>
       </w:r>
     </w:p>
@@ -2796,6 +3033,214 @@
       <w:r>
         <w:t>uint8_t reminderAudio — reminder-audio identifier/value; the supplied header does not define the mapping to audio files.</w:t>
       </w:r>
+    </w:p>
+    <w:p>
+      <w:pPr>
+        <w:pStyle w:val="ListBullet"/>
+        <w:numPr>
+          <w:ilvl w:val="0"/>
+          <w:numId w:val="0"/>
+        </w:numPr>
+        <w:ind w:left="360"/>
+      </w:pPr>
+    </w:p>
+    <w:tbl>
+      <w:tblPr>
+        <w:tblStyle w:val="LightShading-Accent1"/>
+        <w:tblW w:w="0" w:type="auto"/>
+        <w:tblLook w:val="04A0" w:firstRow="1" w:lastRow="0" w:firstColumn="1" w:lastColumn="0" w:noHBand="0" w:noVBand="1"/>
+      </w:tblPr>
+      <w:tblGrid>
+        <w:gridCol w:w="5148"/>
+        <w:gridCol w:w="5148"/>
+      </w:tblGrid>
+      <w:tr>
+        <w:trPr>
+          <w:cnfStyle w:val="100000000000" w:firstRow="1" w:lastRow="0" w:firstColumn="0" w:lastColumn="0" w:oddVBand="0" w:evenVBand="0" w:oddHBand="0" w:evenHBand="0" w:firstRowFirstColumn="0" w:firstRowLastColumn="0" w:lastRowFirstColumn="0" w:lastRowLastColumn="0"/>
+        </w:trPr>
+        <w:tc>
+          <w:tcPr>
+            <w:cnfStyle w:val="001000000000" w:firstRow="0" w:lastRow="0" w:firstColumn="1" w:lastColumn="0" w:oddVBand="0" w:evenVBand="0" w:oddHBand="0" w:evenHBand="0" w:firstRowFirstColumn="0" w:firstRowLastColumn="0" w:lastRowFirstColumn="0" w:lastRowLastColumn="0"/>
+            <w:tcW w:w="5148" w:type="dxa"/>
+          </w:tcPr>
+          <w:p>
+            <w:pPr>
+              <w:pStyle w:val="ListBullet"/>
+              <w:numPr>
+                <w:ilvl w:val="0"/>
+                <w:numId w:val="0"/>
+              </w:numPr>
+              <w:ind w:left="360" w:hanging="360"/>
+              <w:rPr>
+                <w:lang w:val="en-AU"/>
+              </w:rPr>
+            </w:pPr>
+            <w:r>
+              <w:rPr>
+                <w:lang w:val="en-AU"/>
+              </w:rPr>
+              <w:t>struct Task</w:t>
+            </w:r>
+          </w:p>
+          <w:p>
+            <w:pPr>
+              <w:pStyle w:val="ListBullet"/>
+              <w:numPr>
+                <w:ilvl w:val="0"/>
+                <w:numId w:val="0"/>
+              </w:numPr>
+              <w:rPr>
+                <w:lang w:val="en-AU"/>
+              </w:rPr>
+            </w:pPr>
+            <w:r>
+              <w:rPr>
+                <w:lang w:val="en-AU"/>
+              </w:rPr>
+              <w:t>{</w:t>
+            </w:r>
+          </w:p>
+          <w:p>
+            <w:pPr>
+              <w:pStyle w:val="ListBullet"/>
+              <w:numPr>
+                <w:ilvl w:val="0"/>
+                <w:numId w:val="0"/>
+              </w:numPr>
+              <w:rPr>
+                <w:lang w:val="en-AU"/>
+              </w:rPr>
+            </w:pPr>
+            <w:r>
+              <w:rPr>
+                <w:lang w:val="en-AU"/>
+              </w:rPr>
+              <w:t>    TaskType type;</w:t>
+            </w:r>
+          </w:p>
+          <w:p>
+            <w:pPr>
+              <w:pStyle w:val="ListBullet"/>
+              <w:numPr>
+                <w:ilvl w:val="0"/>
+                <w:numId w:val="0"/>
+              </w:numPr>
+              <w:rPr>
+                <w:lang w:val="en-AU"/>
+              </w:rPr>
+            </w:pPr>
+            <w:r>
+              <w:rPr>
+                <w:lang w:val="en-AU"/>
+              </w:rPr>
+              <w:t>    ItemType requiredItems[MAX_TASK_ITEMS];</w:t>
+            </w:r>
+            <w:r>
+              <w:rPr>
+                <w:i/>
+                <w:iCs/>
+                <w:lang w:val="en-AU"/>
+              </w:rPr>
+              <w:t xml:space="preserve"> </w:t>
+            </w:r>
+          </w:p>
+          <w:p>
+            <w:pPr>
+              <w:pStyle w:val="ListBullet"/>
+              <w:numPr>
+                <w:ilvl w:val="0"/>
+                <w:numId w:val="0"/>
+              </w:numPr>
+              <w:rPr>
+                <w:lang w:val="en-AU"/>
+              </w:rPr>
+            </w:pPr>
+            <w:r>
+              <w:rPr>
+                <w:lang w:val="en-AU"/>
+              </w:rPr>
+              <w:t>    uint8_t itemCount;</w:t>
+            </w:r>
+          </w:p>
+          <w:p>
+            <w:pPr>
+              <w:pStyle w:val="ListBullet"/>
+              <w:numPr>
+                <w:ilvl w:val="0"/>
+                <w:numId w:val="0"/>
+              </w:numPr>
+              <w:rPr>
+                <w:lang w:val="en-AU"/>
+              </w:rPr>
+            </w:pPr>
+            <w:r>
+              <w:rPr>
+                <w:lang w:val="en-AU"/>
+              </w:rPr>
+              <w:t>    uint8_t reminderAudio;</w:t>
+            </w:r>
+          </w:p>
+          <w:p>
+            <w:pPr>
+              <w:pStyle w:val="ListBullet"/>
+              <w:numPr>
+                <w:ilvl w:val="0"/>
+                <w:numId w:val="0"/>
+              </w:numPr>
+              <w:ind w:left="360" w:hanging="360"/>
+              <w:rPr>
+                <w:lang w:val="en-AU"/>
+              </w:rPr>
+            </w:pPr>
+            <w:r>
+              <w:rPr>
+                <w:lang w:val="en-AU"/>
+              </w:rPr>
+              <w:t>};</w:t>
+            </w:r>
+          </w:p>
+          <w:p>
+            <w:pPr>
+              <w:pStyle w:val="ListBullet"/>
+              <w:numPr>
+                <w:ilvl w:val="0"/>
+                <w:numId w:val="0"/>
+              </w:numPr>
+              <w:ind w:left="360"/>
+            </w:pPr>
+          </w:p>
+        </w:tc>
+        <w:tc>
+          <w:tcPr>
+            <w:tcW w:w="5148" w:type="dxa"/>
+          </w:tcPr>
+          <w:p>
+            <w:pPr>
+              <w:pStyle w:val="ListBullet"/>
+              <w:numPr>
+                <w:ilvl w:val="0"/>
+                <w:numId w:val="0"/>
+              </w:numPr>
+              <w:spacing w:after="200" w:line="276" w:lineRule="auto"/>
+              <w:ind w:left="360" w:hanging="360"/>
+              <w:cnfStyle w:val="100000000000" w:firstRow="1" w:lastRow="0" w:firstColumn="0" w:lastColumn="0" w:oddVBand="0" w:evenVBand="0" w:oddHBand="0" w:evenHBand="0" w:firstRowFirstColumn="0" w:firstRowLastColumn="0" w:lastRowFirstColumn="0" w:lastRowLastColumn="0"/>
+              <w:rPr>
+                <w:lang w:val="en-AU"/>
+              </w:rPr>
+            </w:pPr>
+          </w:p>
+        </w:tc>
+      </w:tr>
+    </w:tbl>
+    <w:p>
+      <w:pPr>
+        <w:pStyle w:val="ListBullet"/>
+        <w:numPr>
+          <w:ilvl w:val="0"/>
+          <w:numId w:val="0"/>
+        </w:numPr>
+        <w:ind w:left="360" w:hanging="360"/>
+      </w:pPr>
     </w:p>
     <w:p>
       <w:r>
@@ -2844,11 +3289,145 @@
         <w:t>This structure is the connection point between the core and the feedback layer. The feedback layer can map event types to prompts, audio, LEDs, or display messages.</w:t>
       </w:r>
     </w:p>
+    <w:tbl>
+      <w:tblPr>
+        <w:tblStyle w:val="LightShading-Accent1"/>
+        <w:tblW w:w="0" w:type="auto"/>
+        <w:tblLook w:val="04A0" w:firstRow="1" w:lastRow="0" w:firstColumn="1" w:lastColumn="0" w:noHBand="0" w:noVBand="1"/>
+      </w:tblPr>
+      <w:tblGrid>
+        <w:gridCol w:w="5148"/>
+        <w:gridCol w:w="5148"/>
+      </w:tblGrid>
+      <w:tr>
+        <w:trPr>
+          <w:cnfStyle w:val="100000000000" w:firstRow="1" w:lastRow="0" w:firstColumn="0" w:lastColumn="0" w:oddVBand="0" w:evenVBand="0" w:oddHBand="0" w:evenHBand="0" w:firstRowFirstColumn="0" w:firstRowLastColumn="0" w:lastRowFirstColumn="0" w:lastRowLastColumn="0"/>
+        </w:trPr>
+        <w:tc>
+          <w:tcPr>
+            <w:cnfStyle w:val="001000000000" w:firstRow="0" w:lastRow="0" w:firstColumn="1" w:lastColumn="0" w:oddVBand="0" w:evenVBand="0" w:oddHBand="0" w:evenHBand="0" w:firstRowFirstColumn="0" w:firstRowLastColumn="0" w:lastRowFirstColumn="0" w:lastRowLastColumn="0"/>
+            <w:tcW w:w="5148" w:type="dxa"/>
+          </w:tcPr>
+          <w:p>
+            <w:pPr>
+              <w:rPr>
+                <w:b w:val="0"/>
+                <w:bCs w:val="0"/>
+                <w:lang w:val="en-AU"/>
+              </w:rPr>
+            </w:pPr>
+            <w:r>
+              <w:rPr>
+                <w:lang w:val="en-AU"/>
+              </w:rPr>
+              <w:t>struct BackpackEvent</w:t>
+            </w:r>
+          </w:p>
+          <w:p>
+            <w:pPr>
+              <w:rPr>
+                <w:lang w:val="en-AU"/>
+              </w:rPr>
+            </w:pPr>
+            <w:r>
+              <w:rPr>
+                <w:lang w:val="en-AU"/>
+              </w:rPr>
+              <w:t>{</w:t>
+            </w:r>
+          </w:p>
+          <w:p>
+            <w:pPr>
+              <w:rPr>
+                <w:lang w:val="en-AU"/>
+              </w:rPr>
+            </w:pPr>
+            <w:r>
+              <w:rPr>
+                <w:lang w:val="en-AU"/>
+              </w:rPr>
+              <w:t>    EventType type;</w:t>
+            </w:r>
+          </w:p>
+          <w:p>
+            <w:pPr>
+              <w:rPr>
+                <w:lang w:val="en-AU"/>
+              </w:rPr>
+            </w:pPr>
+            <w:r>
+              <w:rPr>
+                <w:lang w:val="en-AU"/>
+              </w:rPr>
+              <w:t>    ItemType item;</w:t>
+            </w:r>
+          </w:p>
+          <w:p>
+            <w:pPr>
+              <w:rPr>
+                <w:lang w:val="en-AU"/>
+              </w:rPr>
+            </w:pPr>
+            <w:r>
+              <w:rPr>
+                <w:lang w:val="en-AU"/>
+              </w:rPr>
+              <w:t>    TaskType task;</w:t>
+            </w:r>
+          </w:p>
+          <w:p>
+            <w:pPr>
+              <w:rPr>
+                <w:lang w:val="en-AU"/>
+              </w:rPr>
+            </w:pPr>
+            <w:r>
+              <w:rPr>
+                <w:lang w:val="en-AU"/>
+              </w:rPr>
+              <w:t>};</w:t>
+            </w:r>
+          </w:p>
+          <w:p>
+            <w:pPr>
+              <w:pStyle w:val="ListBullet"/>
+              <w:numPr>
+                <w:ilvl w:val="0"/>
+                <w:numId w:val="0"/>
+              </w:numPr>
+              <w:ind w:left="360"/>
+            </w:pPr>
+          </w:p>
+        </w:tc>
+        <w:tc>
+          <w:tcPr>
+            <w:tcW w:w="5148" w:type="dxa"/>
+          </w:tcPr>
+          <w:p>
+            <w:pPr>
+              <w:pStyle w:val="ListBullet"/>
+              <w:numPr>
+                <w:ilvl w:val="0"/>
+                <w:numId w:val="0"/>
+              </w:numPr>
+              <w:spacing w:after="200" w:line="276" w:lineRule="auto"/>
+              <w:ind w:left="360" w:hanging="360"/>
+              <w:cnfStyle w:val="100000000000" w:firstRow="1" w:lastRow="0" w:firstColumn="0" w:lastColumn="0" w:oddVBand="0" w:evenVBand="0" w:oddHBand="0" w:evenHBand="0" w:firstRowFirstColumn="0" w:firstRowLastColumn="0" w:lastRowFirstColumn="0" w:lastRowLastColumn="0"/>
+              <w:rPr>
+                <w:lang w:val="en-AU"/>
+              </w:rPr>
+            </w:pPr>
+          </w:p>
+        </w:tc>
+      </w:tr>
+    </w:tbl>
+    <w:p/>
     <w:p>
       <w:pPr>
         <w:pStyle w:val="Heading1"/>
       </w:pPr>
       <w:r>
+        <w:lastRenderedPageBreak/>
         <w:t>6. Class APIs and Function Guide</w:t>
       </w:r>
     </w:p>
@@ -3080,7 +3659,13 @@
           </w:tcPr>
           <w:p>
             <w:r>
-              <w:t>itemScanned(uint32_t tagID)</w:t>
+              <w:t>itemScanned(</w:t>
+            </w:r>
+            <w:r>
+              <w:t>RFIDTagID</w:t>
+            </w:r>
+            <w:r>
+              <w:t xml:space="preserve"> tagID)</w:t>
             </w:r>
           </w:p>
         </w:tc>
@@ -3106,7 +3691,13 @@
           </w:tcPr>
           <w:p>
             <w:r>
-              <w:t>itemAdded(uint32_t tagID)</w:t>
+              <w:t>itemAdded(</w:t>
+            </w:r>
+            <w:r>
+              <w:t>RFIDTagID</w:t>
+            </w:r>
+            <w:r>
+              <w:t xml:space="preserve"> tagID)</w:t>
             </w:r>
           </w:p>
         </w:tc>
@@ -3135,7 +3726,13 @@
           </w:tcPr>
           <w:p>
             <w:r>
-              <w:t>itemRemoved(uint32_t tagID)</w:t>
+              <w:t>itemRemoved(</w:t>
+            </w:r>
+            <w:r>
+              <w:t>RFIDTagID</w:t>
+            </w:r>
+            <w:r>
+              <w:t xml:space="preserve"> tagID)</w:t>
             </w:r>
           </w:p>
         </w:tc>
@@ -3408,7 +4005,6 @@
           </w:tcPr>
           <w:p>
             <w:r>
-              <w:lastRenderedPageBreak/>
               <w:t>Method</w:t>
             </w:r>
           </w:p>
@@ -3493,7 +4089,13 @@
           </w:tcPr>
           <w:p>
             <w:r>
-              <w:t>findItem(uint32_t tagID)</w:t>
+              <w:t>findItem(</w:t>
+            </w:r>
+            <w:r>
+              <w:t>RFIDTagID</w:t>
+            </w:r>
+            <w:r>
+              <w:t xml:space="preserve"> tagID)</w:t>
             </w:r>
           </w:p>
         </w:tc>
@@ -3519,7 +4121,13 @@
           </w:tcPr>
           <w:p>
             <w:r>
-              <w:t>registerItem(uint32_t tagID, ItemType type)</w:t>
+              <w:t>registerItem(</w:t>
+            </w:r>
+            <w:r>
+              <w:t>RFIDTagID tagID</w:t>
+            </w:r>
+            <w:r>
+              <w:t>, ItemType type)</w:t>
             </w:r>
           </w:p>
         </w:tc>
@@ -3548,7 +4156,13 @@
           </w:tcPr>
           <w:p>
             <w:r>
-              <w:t>addItem(uint32_t tagID)</w:t>
+              <w:t>addItem(</w:t>
+            </w:r>
+            <w:r>
+              <w:t>RFIDTagID tagID</w:t>
+            </w:r>
+            <w:r>
+              <w:t>)</w:t>
             </w:r>
           </w:p>
         </w:tc>
@@ -3574,7 +4188,13 @@
           </w:tcPr>
           <w:p>
             <w:r>
-              <w:t>removeItem(uint32_t tagID)</w:t>
+              <w:t>removeItem(</w:t>
+            </w:r>
+            <w:r>
+              <w:t>RFIDTagID tagID</w:t>
+            </w:r>
+            <w:r>
+              <w:t>)</w:t>
             </w:r>
           </w:p>
         </w:tc>
@@ -3629,7 +4249,13 @@
           </w:tcPr>
           <w:p>
             <w:r>
-              <w:t>getItemType(uint32_t tagID) const</w:t>
+              <w:t>getItemType(</w:t>
+            </w:r>
+            <w:r>
+              <w:t>RFIDTagID tagID</w:t>
+            </w:r>
+            <w:r>
+              <w:t>) const</w:t>
             </w:r>
           </w:p>
         </w:tc>
@@ -3651,25 +4277,7 @@
     <w:p>
       <w:r>
         <w:br/>
-      </w:r>
-      <w:r>
-        <w:t xml:space="preserve">The latest project save point also records a new accessor `Item* </w:t>
-      </w:r>
-      <w:proofErr w:type="gramStart"/>
-      <w:r>
-        <w:t>getItemAt(</w:t>
-      </w:r>
-      <w:proofErr w:type="gramEnd"/>
-      <w:r>
-        <w:t xml:space="preserve">uint8_t </w:t>
-      </w:r>
-      <w:proofErr w:type="gramStart"/>
-      <w:r>
-        <w:t>index)`</w:t>
-      </w:r>
-      <w:proofErr w:type="gramEnd"/>
-      <w:r>
-        <w:t>, returning nullptr when index is out of range. This accessor is useful for safe iteration by a console or display layer. Check the repository's current Inventory.h before coding because the pasted header and save point differ.</w:t>
+        <w:t>The latest project save point also records a new accessor `Item* getItemAt(uint8_t index)`, returning nullptr when index is out of range. This accessor is useful for safe iteration by a console or display layer. Check the repository's current Inventory.h before coding because the pasted header and save point differ.</w:t>
       </w:r>
     </w:p>
     <w:p>
@@ -3693,6 +4301,7 @@
         <w:pStyle w:val="ListBullet"/>
       </w:pPr>
       <w:r>
+        <w:lastRenderedPageBreak/>
         <w:t>registerTask(const Task&amp; task) — stores a task if accepted by the implementation.</w:t>
       </w:r>
     </w:p>
@@ -3869,13 +4478,6 @@
           <w:sz w:val="18"/>
         </w:rPr>
         <w:br/>
-      </w:r>
-      <w:r>
-        <w:rPr>
-          <w:rFonts w:ascii="Consolas" w:hAnsi="Consolas"/>
-          <w:sz w:val="18"/>
-        </w:rPr>
-        <w:lastRenderedPageBreak/>
         <w:t>universityTask.reminderAudio = 1;</w:t>
       </w:r>
       <w:r>
@@ -3938,7 +4540,118 @@
         <w:pStyle w:val="Heading1"/>
       </w:pPr>
       <w:r>
-        <w:t>8. Typical Arduino Setup Pattern</w:t>
+        <w:t>8. Example Item Definition</w:t>
+      </w:r>
+    </w:p>
+    <w:p>
+      <w:r>
+        <w:t>The following illustrates how a developer can populate a</w:t>
+      </w:r>
+      <w:r>
+        <w:t>n Item</w:t>
+      </w:r>
+      <w:r>
+        <w:t>. It is a template example</w:t>
+      </w:r>
+      <w:r>
+        <w:t xml:space="preserve"> on how to register items with the inventory</w:t>
+      </w:r>
+      <w:r>
+        <w:t>, which sets its location flag to Location::Unknown internally.</w:t>
+      </w:r>
+    </w:p>
+    <w:p>
+      <w:pPr>
+        <w:spacing w:after="0" w:line="240" w:lineRule="auto"/>
+        <w:rPr>
+          <w:rFonts w:ascii="Consolas" w:hAnsi="Consolas"/>
+          <w:sz w:val="18"/>
+          <w:szCs w:val="18"/>
+          <w:lang w:val="en-AU"/>
+        </w:rPr>
+      </w:pPr>
+      <w:r>
+        <w:rPr>
+          <w:rFonts w:ascii="Consolas" w:hAnsi="Consolas"/>
+          <w:sz w:val="18"/>
+          <w:szCs w:val="18"/>
+          <w:lang w:val="en-AU"/>
+        </w:rPr>
+        <w:t>inventory.registerItem(</w:t>
+      </w:r>
+    </w:p>
+    <w:p>
+      <w:pPr>
+        <w:spacing w:after="0" w:line="240" w:lineRule="auto"/>
+        <w:ind w:firstLine="720"/>
+        <w:rPr>
+          <w:rFonts w:ascii="Consolas" w:hAnsi="Consolas"/>
+          <w:sz w:val="18"/>
+          <w:szCs w:val="18"/>
+          <w:lang w:val="en-AU"/>
+        </w:rPr>
+      </w:pPr>
+      <w:r>
+        <w:rPr>
+          <w:rFonts w:ascii="Consolas" w:hAnsi="Consolas"/>
+          <w:sz w:val="18"/>
+          <w:szCs w:val="18"/>
+          <w:lang w:val="en-AU"/>
+        </w:rPr>
+        <w:t>RFIDTagID{{00, 00, 00, 01}, 4},</w:t>
+      </w:r>
+    </w:p>
+    <w:p>
+      <w:pPr>
+        <w:spacing w:after="0" w:line="240" w:lineRule="auto"/>
+        <w:ind w:firstLine="720"/>
+        <w:rPr>
+          <w:rFonts w:ascii="Consolas" w:hAnsi="Consolas"/>
+          <w:sz w:val="18"/>
+          <w:szCs w:val="18"/>
+          <w:lang w:val="en-AU"/>
+        </w:rPr>
+      </w:pPr>
+      <w:r>
+        <w:rPr>
+          <w:rFonts w:ascii="Consolas" w:hAnsi="Consolas"/>
+          <w:sz w:val="18"/>
+          <w:szCs w:val="18"/>
+          <w:lang w:val="en-AU"/>
+        </w:rPr>
+        <w:t>ItemType::Wallet</w:t>
+      </w:r>
+    </w:p>
+    <w:p>
+      <w:pPr>
+        <w:spacing w:after="0" w:line="240" w:lineRule="auto"/>
+        <w:rPr>
+          <w:rFonts w:ascii="Consolas" w:hAnsi="Consolas"/>
+          <w:sz w:val="18"/>
+          <w:szCs w:val="18"/>
+          <w:lang w:val="en-AU"/>
+        </w:rPr>
+      </w:pPr>
+      <w:r>
+        <w:rPr>
+          <w:rFonts w:ascii="Consolas" w:hAnsi="Consolas"/>
+          <w:sz w:val="18"/>
+          <w:szCs w:val="18"/>
+          <w:lang w:val="en-AU"/>
+        </w:rPr>
+        <w:t>)</w:t>
+      </w:r>
+    </w:p>
+    <w:p>
+      <w:pPr>
+        <w:pStyle w:val="Heading1"/>
+      </w:pPr>
+      <w:r>
+        <w:lastRenderedPageBreak/>
+        <w:t>9</w:t>
+      </w:r>
+      <w:r>
+        <w:t>. Typical Arduino Setup Pattern</w:t>
       </w:r>
     </w:p>
     <w:p>
@@ -4097,7 +4810,10 @@
         <w:pStyle w:val="Heading1"/>
       </w:pPr>
       <w:r>
-        <w:t>9. Inventory and Task Flow — Conceptual Example</w:t>
+        <w:t>10</w:t>
+      </w:r>
+      <w:r>
+        <w:t>. Inventory and Task Flow — Conceptual Example</w:t>
       </w:r>
     </w:p>
     <w:p>
@@ -4169,8 +4885,13 @@
         <w:pStyle w:val="Heading1"/>
       </w:pPr>
       <w:r>
-        <w:lastRenderedPageBreak/>
-        <w:t>10. Event Queue and Feedback Integration</w:t>
+        <w:t>1</w:t>
+      </w:r>
+      <w:r>
+        <w:t>1</w:t>
+      </w:r>
+      <w:r>
+        <w:t>. Event Queue and Feedback Integration</w:t>
       </w:r>
     </w:p>
     <w:p>
@@ -4180,6 +4901,7 @@
     </w:p>
     <w:p>
       <w:r>
+        <w:lastRenderedPageBreak/>
         <w:t>EventGenerator has a fixed capacity of MAX_EVENTS (10). Since emit() returns bool, code should not assume every event was successfully queued. Decide which component owns event consumption. A single FIFO consumer removes events from the queue; multiple feedback consumers require an explicit dispatch/broadcast strategy.</w:t>
       </w:r>
     </w:p>
@@ -4188,7 +4910,13 @@
         <w:pStyle w:val="Heading1"/>
       </w:pPr>
       <w:r>
-        <w:t>11. Important Implementation Checks</w:t>
+        <w:t>1</w:t>
+      </w:r>
+      <w:r>
+        <w:t>2</w:t>
+      </w:r>
+      <w:r>
+        <w:t>. Important Implementation Checks</w:t>
       </w:r>
     </w:p>
     <w:p>
@@ -4268,7 +4996,13 @@
         <w:pStyle w:val="Heading1"/>
       </w:pPr>
       <w:r>
-        <w:t>12. Source and Confidence Note</w:t>
+        <w:t>1</w:t>
+      </w:r>
+      <w:r>
+        <w:t>3</w:t>
+      </w:r>
+      <w:r>
+        <w:t>. Source and Confidence Note</w:t>
       </w:r>
     </w:p>
     <w:p>
@@ -5159,7 +5893,6 @@
   <w:style w:type="character" w:default="1" w:styleId="DefaultParagraphFont">
     <w:name w:val="Default Paragraph Font"/>
     <w:uiPriority w:val="1"/>
-    <w:semiHidden/>
     <w:unhideWhenUsed/>
   </w:style>
   <w:style w:type="table" w:default="1" w:styleId="TableNormal">
@@ -14077,7 +14810,7 @@
       </w:tcPr>
     </w:tblStylePr>
   </w:style>
-  <w:style w:type="table" w:styleId="ColorfulShading">
+  <w:style w:type="table" w:styleId="ColourfulShading">
     <w:name w:val="Colorful Shading"/>
     <w:basedOn w:val="TableNormal"/>
     <w:uiPriority w:val="71"/>
@@ -14192,7 +14925,7 @@
       </w:rPr>
     </w:tblStylePr>
   </w:style>
-  <w:style w:type="table" w:styleId="ColorfulShading-Accent1">
+  <w:style w:type="table" w:styleId="ColourfulShadingAccent1">
     <w:name w:val="Colorful Shading Accent 1"/>
     <w:basedOn w:val="TableNormal"/>
     <w:uiPriority w:val="71"/>
@@ -14307,7 +15040,7 @@
       </w:rPr>
     </w:tblStylePr>
   </w:style>
-  <w:style w:type="table" w:styleId="ColorfulShading-Accent2">
+  <w:style w:type="table" w:styleId="ColourfulShadingAccent2">
     <w:name w:val="Colorful Shading Accent 2"/>
     <w:basedOn w:val="TableNormal"/>
     <w:uiPriority w:val="71"/>
@@ -14422,7 +15155,7 @@
       </w:rPr>
     </w:tblStylePr>
   </w:style>
-  <w:style w:type="table" w:styleId="ColorfulShading-Accent3">
+  <w:style w:type="table" w:styleId="ColourfulShadingAccent3">
     <w:name w:val="Colorful Shading Accent 3"/>
     <w:basedOn w:val="TableNormal"/>
     <w:uiPriority w:val="71"/>
@@ -14527,7 +15260,7 @@
       </w:tcPr>
     </w:tblStylePr>
   </w:style>
-  <w:style w:type="table" w:styleId="ColorfulShading-Accent4">
+  <w:style w:type="table" w:styleId="ColourfulShadingAccent4">
     <w:name w:val="Colorful Shading Accent 4"/>
     <w:basedOn w:val="TableNormal"/>
     <w:uiPriority w:val="71"/>
@@ -14642,7 +15375,7 @@
       </w:rPr>
     </w:tblStylePr>
   </w:style>
-  <w:style w:type="table" w:styleId="ColorfulShading-Accent5">
+  <w:style w:type="table" w:styleId="ColourfulShadingAccent5">
     <w:name w:val="Colorful Shading Accent 5"/>
     <w:basedOn w:val="TableNormal"/>
     <w:uiPriority w:val="71"/>
@@ -14757,7 +15490,7 @@
       </w:rPr>
     </w:tblStylePr>
   </w:style>
-  <w:style w:type="table" w:styleId="ColorfulShading-Accent6">
+  <w:style w:type="table" w:styleId="ColourfulShadingAccent6">
     <w:name w:val="Colorful Shading Accent 6"/>
     <w:basedOn w:val="TableNormal"/>
     <w:uiPriority w:val="71"/>
@@ -14872,7 +15605,7 @@
       </w:rPr>
     </w:tblStylePr>
   </w:style>
-  <w:style w:type="table" w:styleId="ColorfulList">
+  <w:style w:type="table" w:styleId="ColourfulList">
     <w:name w:val="Colorful List"/>
     <w:basedOn w:val="TableNormal"/>
     <w:uiPriority w:val="72"/>
@@ -14951,7 +15684,7 @@
       </w:tcPr>
     </w:tblStylePr>
   </w:style>
-  <w:style w:type="table" w:styleId="ColorfulList-Accent1">
+  <w:style w:type="table" w:styleId="ColourfulListAccent1">
     <w:name w:val="Colorful List Accent 1"/>
     <w:basedOn w:val="TableNormal"/>
     <w:uiPriority w:val="72"/>
@@ -15030,7 +15763,7 @@
       </w:tcPr>
     </w:tblStylePr>
   </w:style>
-  <w:style w:type="table" w:styleId="ColorfulList-Accent2">
+  <w:style w:type="table" w:styleId="ColourfulListAccent2">
     <w:name w:val="Colorful List Accent 2"/>
     <w:basedOn w:val="TableNormal"/>
     <w:uiPriority w:val="72"/>
@@ -15109,7 +15842,7 @@
       </w:tcPr>
     </w:tblStylePr>
   </w:style>
-  <w:style w:type="table" w:styleId="ColorfulList-Accent3">
+  <w:style w:type="table" w:styleId="ColourfulListAccent3">
     <w:name w:val="Colorful List Accent 3"/>
     <w:basedOn w:val="TableNormal"/>
     <w:uiPriority w:val="72"/>
@@ -15188,7 +15921,7 @@
       </w:tcPr>
     </w:tblStylePr>
   </w:style>
-  <w:style w:type="table" w:styleId="ColorfulList-Accent4">
+  <w:style w:type="table" w:styleId="ColourfulListAccent4">
     <w:name w:val="Colorful List Accent 4"/>
     <w:basedOn w:val="TableNormal"/>
     <w:uiPriority w:val="72"/>
@@ -15267,7 +16000,7 @@
       </w:tcPr>
     </w:tblStylePr>
   </w:style>
-  <w:style w:type="table" w:styleId="ColorfulList-Accent5">
+  <w:style w:type="table" w:styleId="ColourfulListAccent5">
     <w:name w:val="Colorful List Accent 5"/>
     <w:basedOn w:val="TableNormal"/>
     <w:uiPriority w:val="72"/>
@@ -15346,7 +16079,7 @@
       </w:tcPr>
     </w:tblStylePr>
   </w:style>
-  <w:style w:type="table" w:styleId="ColorfulList-Accent6">
+  <w:style w:type="table" w:styleId="ColourfulListAccent6">
     <w:name w:val="Colorful List Accent 6"/>
     <w:basedOn w:val="TableNormal"/>
     <w:uiPriority w:val="72"/>
@@ -15425,7 +16158,7 @@
       </w:tcPr>
     </w:tblStylePr>
   </w:style>
-  <w:style w:type="table" w:styleId="ColorfulGrid">
+  <w:style w:type="table" w:styleId="ColourfulGrid">
     <w:name w:val="Colorful Grid"/>
     <w:basedOn w:val="TableNormal"/>
     <w:uiPriority w:val="73"/>
@@ -15498,7 +16231,7 @@
       </w:tcPr>
     </w:tblStylePr>
   </w:style>
-  <w:style w:type="table" w:styleId="ColorfulGrid-Accent1">
+  <w:style w:type="table" w:styleId="ColourfulGridAccent1">
     <w:name w:val="Colorful Grid Accent 1"/>
     <w:basedOn w:val="TableNormal"/>
     <w:uiPriority w:val="73"/>
@@ -15571,7 +16304,7 @@
       </w:tcPr>
     </w:tblStylePr>
   </w:style>
-  <w:style w:type="table" w:styleId="ColorfulGrid-Accent2">
+  <w:style w:type="table" w:styleId="ColourfulGridAccent2">
     <w:name w:val="Colorful Grid Accent 2"/>
     <w:basedOn w:val="TableNormal"/>
     <w:uiPriority w:val="73"/>
@@ -15644,7 +16377,7 @@
       </w:tcPr>
     </w:tblStylePr>
   </w:style>
-  <w:style w:type="table" w:styleId="ColorfulGrid-Accent3">
+  <w:style w:type="table" w:styleId="ColourfulGridAccent3">
     <w:name w:val="Colorful Grid Accent 3"/>
     <w:basedOn w:val="TableNormal"/>
     <w:uiPriority w:val="73"/>
@@ -15717,7 +16450,7 @@
       </w:tcPr>
     </w:tblStylePr>
   </w:style>
-  <w:style w:type="table" w:styleId="ColorfulGrid-Accent4">
+  <w:style w:type="table" w:styleId="ColourfulGridAccent4">
     <w:name w:val="Colorful Grid Accent 4"/>
     <w:basedOn w:val="TableNormal"/>
     <w:uiPriority w:val="73"/>
@@ -15790,7 +16523,7 @@
       </w:tcPr>
     </w:tblStylePr>
   </w:style>
-  <w:style w:type="table" w:styleId="ColorfulGrid-Accent5">
+  <w:style w:type="table" w:styleId="ColourfulGridAccent5">
     <w:name w:val="Colorful Grid Accent 5"/>
     <w:basedOn w:val="TableNormal"/>
     <w:uiPriority w:val="73"/>
@@ -15863,7 +16596,7 @@
       </w:tcPr>
     </w:tblStylePr>
   </w:style>
-  <w:style w:type="table" w:styleId="ColorfulGrid-Accent6">
+  <w:style w:type="table" w:styleId="ColourfulGridAccent6">
     <w:name w:val="Colorful Grid Accent 6"/>
     <w:basedOn w:val="TableNormal"/>
     <w:uiPriority w:val="73"/>
@@ -15933,6 +16666,142 @@
       <w:tblPr/>
       <w:tcPr>
         <w:shd w:val="clear" w:color="auto" w:fill="FBCAA2" w:themeFill="accent6" w:themeFillTint="7F"/>
+      </w:tcPr>
+    </w:tblStylePr>
+  </w:style>
+  <w:style w:type="table" w:styleId="GridTable3-Accent1">
+    <w:name w:val="Grid Table 3 Accent 1"/>
+    <w:basedOn w:val="TableNormal"/>
+    <w:uiPriority w:val="48"/>
+    <w:rsid w:val="009860E5"/>
+    <w:pPr>
+      <w:spacing w:after="0" w:line="240" w:lineRule="auto"/>
+    </w:pPr>
+    <w:tblPr>
+      <w:tblStyleRowBandSize w:val="1"/>
+      <w:tblStyleColBandSize w:val="1"/>
+      <w:tblBorders>
+        <w:top w:val="single" w:sz="4" w:space="0" w:color="95B3D7" w:themeColor="accent1" w:themeTint="99"/>
+        <w:left w:val="single" w:sz="4" w:space="0" w:color="95B3D7" w:themeColor="accent1" w:themeTint="99"/>
+        <w:bottom w:val="single" w:sz="4" w:space="0" w:color="95B3D7" w:themeColor="accent1" w:themeTint="99"/>
+        <w:right w:val="single" w:sz="4" w:space="0" w:color="95B3D7" w:themeColor="accent1" w:themeTint="99"/>
+        <w:insideH w:val="single" w:sz="4" w:space="0" w:color="95B3D7" w:themeColor="accent1" w:themeTint="99"/>
+        <w:insideV w:val="single" w:sz="4" w:space="0" w:color="95B3D7" w:themeColor="accent1" w:themeTint="99"/>
+      </w:tblBorders>
+    </w:tblPr>
+    <w:tblStylePr w:type="firstRow">
+      <w:rPr>
+        <w:b/>
+        <w:bCs/>
+      </w:rPr>
+      <w:tblPr/>
+      <w:tcPr>
+        <w:tcBorders>
+          <w:top w:val="nil"/>
+          <w:left w:val="nil"/>
+          <w:right w:val="nil"/>
+          <w:insideH w:val="nil"/>
+          <w:insideV w:val="nil"/>
+        </w:tcBorders>
+        <w:shd w:val="clear" w:color="auto" w:fill="FFFFFF" w:themeFill="background1"/>
+      </w:tcPr>
+    </w:tblStylePr>
+    <w:tblStylePr w:type="lastRow">
+      <w:rPr>
+        <w:b/>
+        <w:bCs/>
+      </w:rPr>
+      <w:tblPr/>
+      <w:tcPr>
+        <w:tcBorders>
+          <w:left w:val="nil"/>
+          <w:bottom w:val="nil"/>
+          <w:right w:val="nil"/>
+          <w:insideH w:val="nil"/>
+          <w:insideV w:val="nil"/>
+        </w:tcBorders>
+        <w:shd w:val="clear" w:color="auto" w:fill="FFFFFF" w:themeFill="background1"/>
+      </w:tcPr>
+    </w:tblStylePr>
+    <w:tblStylePr w:type="firstCol">
+      <w:pPr>
+        <w:jc w:val="right"/>
+      </w:pPr>
+      <w:rPr>
+        <w:i/>
+        <w:iCs/>
+      </w:rPr>
+      <w:tblPr/>
+      <w:tcPr>
+        <w:tcBorders>
+          <w:top w:val="nil"/>
+          <w:left w:val="nil"/>
+          <w:bottom w:val="nil"/>
+          <w:insideH w:val="nil"/>
+          <w:insideV w:val="nil"/>
+        </w:tcBorders>
+        <w:shd w:val="clear" w:color="auto" w:fill="FFFFFF" w:themeFill="background1"/>
+      </w:tcPr>
+    </w:tblStylePr>
+    <w:tblStylePr w:type="lastCol">
+      <w:rPr>
+        <w:i/>
+        <w:iCs/>
+      </w:rPr>
+      <w:tblPr/>
+      <w:tcPr>
+        <w:tcBorders>
+          <w:top w:val="nil"/>
+          <w:bottom w:val="nil"/>
+          <w:right w:val="nil"/>
+          <w:insideH w:val="nil"/>
+          <w:insideV w:val="nil"/>
+        </w:tcBorders>
+        <w:shd w:val="clear" w:color="auto" w:fill="FFFFFF" w:themeFill="background1"/>
+      </w:tcPr>
+    </w:tblStylePr>
+    <w:tblStylePr w:type="band1Vert">
+      <w:tblPr/>
+      <w:tcPr>
+        <w:shd w:val="clear" w:color="auto" w:fill="DBE5F1" w:themeFill="accent1" w:themeFillTint="33"/>
+      </w:tcPr>
+    </w:tblStylePr>
+    <w:tblStylePr w:type="band1Horz">
+      <w:tblPr/>
+      <w:tcPr>
+        <w:shd w:val="clear" w:color="auto" w:fill="DBE5F1" w:themeFill="accent1" w:themeFillTint="33"/>
+      </w:tcPr>
+    </w:tblStylePr>
+    <w:tblStylePr w:type="neCell">
+      <w:tblPr/>
+      <w:tcPr>
+        <w:tcBorders>
+          <w:bottom w:val="single" w:sz="4" w:space="0" w:color="95B3D7" w:themeColor="accent1" w:themeTint="99"/>
+        </w:tcBorders>
+      </w:tcPr>
+    </w:tblStylePr>
+    <w:tblStylePr w:type="nwCell">
+      <w:tblPr/>
+      <w:tcPr>
+        <w:tcBorders>
+          <w:bottom w:val="single" w:sz="4" w:space="0" w:color="95B3D7" w:themeColor="accent1" w:themeTint="99"/>
+        </w:tcBorders>
+      </w:tcPr>
+    </w:tblStylePr>
+    <w:tblStylePr w:type="seCell">
+      <w:tblPr/>
+      <w:tcPr>
+        <w:tcBorders>
+          <w:top w:val="single" w:sz="4" w:space="0" w:color="95B3D7" w:themeColor="accent1" w:themeTint="99"/>
+        </w:tcBorders>
+      </w:tcPr>
+    </w:tblStylePr>
+    <w:tblStylePr w:type="swCell">
+      <w:tblPr/>
+      <w:tcPr>
+        <w:tcBorders>
+          <w:top w:val="single" w:sz="4" w:space="0" w:color="95B3D7" w:themeColor="accent1" w:themeTint="99"/>
+        </w:tcBorders>
       </w:tcPr>
     </w:tblStylePr>
   </w:style>

</xml_diff>